<commit_message>
build mediamtx from dockerfile
</commit_message>
<xml_diff>
--- a/new mediamtx/Secure stream.docx
+++ b/new mediamtx/Secure stream.docx
@@ -383,167 +383,10 @@
     </w:p>
     <w:p>
       <w:pPr>
-        <w:shd w:val="clear" w:color="auto" w:fill="FFFFFF"/>
-        <w:spacing w:before="480" w:after="240" w:line="480" w:lineRule="atLeast"/>
-        <w:outlineLvl w:val="1"/>
-        <w:rPr>
-          <w:rFonts w:ascii="Abadi" w:eastAsia="Times New Roman" w:hAnsi="Abadi" w:cs="Segoe UI"/>
-          <w:color w:val="156082" w:themeColor="accent1"/>
-          <w:kern w:val="0"/>
-          <w:sz w:val="28"/>
-          <w:szCs w:val="28"/>
-          <w14:ligatures w14:val="none"/>
-        </w:rPr>
-      </w:pPr>
-      <w:r>
-        <w:rPr>
-          <w:rFonts w:ascii="Abadi" w:eastAsia="Times New Roman" w:hAnsi="Abadi" w:cs="Segoe UI"/>
-          <w:color w:val="156082" w:themeColor="accent1"/>
-          <w:kern w:val="0"/>
-          <w:sz w:val="28"/>
-          <w:szCs w:val="28"/>
-          <w14:ligatures w14:val="none"/>
-        </w:rPr>
-        <w:t>public class StreamTokenService {</w:t>
-      </w:r>
-    </w:p>
-    <w:p>
-      <w:pPr>
-        <w:shd w:val="clear" w:color="auto" w:fill="FFFFFF"/>
-        <w:spacing w:before="480" w:after="240" w:line="480" w:lineRule="atLeast"/>
-        <w:outlineLvl w:val="1"/>
-        <w:rPr>
-          <w:rFonts w:ascii="Abadi" w:eastAsia="Times New Roman" w:hAnsi="Abadi" w:cs="Segoe UI"/>
-          <w:color w:val="156082" w:themeColor="accent1"/>
-          <w:kern w:val="0"/>
-          <w:sz w:val="28"/>
-          <w:szCs w:val="28"/>
-          <w14:ligatures w14:val="none"/>
-        </w:rPr>
-      </w:pPr>
-      <w:r>
-        <w:rPr>
-          <w:rFonts w:ascii="Abadi" w:eastAsia="Times New Roman" w:hAnsi="Abadi" w:cs="Segoe UI"/>
-          <w:color w:val="156082" w:themeColor="accent1"/>
-          <w:kern w:val="0"/>
-          <w:sz w:val="28"/>
-          <w:szCs w:val="28"/>
-          <w14:ligatures w14:val="none"/>
-        </w:rPr>
-        <w:t xml:space="preserve">   private readonly IConfiguration _config;</w:t>
-      </w:r>
-    </w:p>
-    <w:p>
-      <w:pPr>
-        <w:shd w:val="clear" w:color="auto" w:fill="FFFFFF"/>
-        <w:spacing w:before="480" w:after="240" w:line="480" w:lineRule="atLeast"/>
-        <w:outlineLvl w:val="1"/>
-        <w:rPr>
-          <w:rFonts w:ascii="Abadi" w:eastAsia="Times New Roman" w:hAnsi="Abadi" w:cs="Segoe UI"/>
-          <w:color w:val="156082" w:themeColor="accent1"/>
-          <w:kern w:val="0"/>
-          <w:sz w:val="28"/>
-          <w:szCs w:val="28"/>
-          <w14:ligatures w14:val="none"/>
-        </w:rPr>
-      </w:pPr>
-      <w:r>
-        <w:rPr>
-          <w:rFonts w:ascii="Abadi" w:eastAsia="Times New Roman" w:hAnsi="Abadi" w:cs="Segoe UI"/>
-          <w:color w:val="156082" w:themeColor="accent1"/>
-          <w:kern w:val="0"/>
-          <w:sz w:val="28"/>
-          <w:szCs w:val="28"/>
-          <w14:ligatures w14:val="none"/>
-        </w:rPr>
-        <w:t>public StreamTokenService ( IConfiguration config ) {</w:t>
-      </w:r>
-    </w:p>
-    <w:p>
-      <w:pPr>
-        <w:shd w:val="clear" w:color="auto" w:fill="FFFFFF"/>
-        <w:spacing w:before="480" w:after="240" w:line="480" w:lineRule="atLeast"/>
-        <w:outlineLvl w:val="1"/>
-        <w:rPr>
-          <w:rFonts w:ascii="Abadi" w:eastAsia="Times New Roman" w:hAnsi="Abadi" w:cs="Segoe UI"/>
-          <w:color w:val="156082" w:themeColor="accent1"/>
-          <w:kern w:val="0"/>
-          <w:sz w:val="28"/>
-          <w:szCs w:val="28"/>
-          <w14:ligatures w14:val="none"/>
-        </w:rPr>
-      </w:pPr>
-      <w:r>
-        <w:rPr>
-          <w:rFonts w:ascii="Abadi" w:eastAsia="Times New Roman" w:hAnsi="Abadi" w:cs="Segoe UI"/>
-          <w:color w:val="156082" w:themeColor="accent1"/>
-          <w:kern w:val="0"/>
-          <w:sz w:val="28"/>
-          <w:szCs w:val="28"/>
-          <w14:ligatures w14:val="none"/>
-        </w:rPr>
-        <w:t xml:space="preserve">   _config = config;</w:t>
-      </w:r>
-    </w:p>
-    <w:p>
-      <w:pPr>
-        <w:shd w:val="clear" w:color="auto" w:fill="FFFFFF"/>
-        <w:spacing w:before="480" w:after="240" w:line="480" w:lineRule="atLeast"/>
-        <w:outlineLvl w:val="1"/>
-        <w:rPr>
-          <w:rFonts w:ascii="Abadi" w:eastAsia="Times New Roman" w:hAnsi="Abadi" w:cs="Segoe UI"/>
-          <w:color w:val="156082" w:themeColor="accent1"/>
-          <w:kern w:val="0"/>
-          <w:sz w:val="28"/>
-          <w:szCs w:val="28"/>
-          <w14:ligatures w14:val="none"/>
-        </w:rPr>
-      </w:pPr>
-      <w:r>
-        <w:rPr>
-          <w:rFonts w:ascii="Abadi" w:eastAsia="Times New Roman" w:hAnsi="Abadi" w:cs="Segoe UI"/>
-          <w:color w:val="156082" w:themeColor="accent1"/>
-          <w:kern w:val="0"/>
-          <w:sz w:val="28"/>
-          <w:szCs w:val="28"/>
-          <w14:ligatures w14:val="none"/>
-        </w:rPr>
-        <w:t xml:space="preserve">} </w:t>
-      </w:r>
-    </w:p>
-    <w:p>
-      <w:pPr>
-        <w:shd w:val="clear" w:color="auto" w:fill="FFFFFF"/>
-        <w:spacing w:before="480" w:after="240" w:line="480" w:lineRule="atLeast"/>
-        <w:outlineLvl w:val="1"/>
-        <w:rPr>
-          <w:rFonts w:ascii="Abadi" w:eastAsia="Times New Roman" w:hAnsi="Abadi" w:cs="Segoe UI"/>
-          <w:color w:val="156082" w:themeColor="accent1"/>
-          <w:kern w:val="0"/>
-          <w:sz w:val="28"/>
-          <w:szCs w:val="28"/>
-          <w14:ligatures w14:val="none"/>
-        </w:rPr>
-      </w:pPr>
-      <w:r>
-        <w:rPr>
-          <w:rFonts w:ascii="Abadi" w:eastAsia="Times New Roman" w:hAnsi="Abadi" w:cs="Segoe UI"/>
-          <w:color w:val="156082" w:themeColor="accent1"/>
-          <w:kern w:val="0"/>
-          <w:sz w:val="28"/>
-          <w:szCs w:val="28"/>
-          <w14:ligatures w14:val="none"/>
-        </w:rPr>
-        <w:lastRenderedPageBreak/>
-        <w:t>}</w:t>
-      </w:r>
-    </w:p>
-    <w:p>
-      <w:pPr>
         <w:pStyle w:val="ListParagraph"/>
         <w:ind w:left="465"/>
         <w:rPr>
-          <w:rFonts w:ascii="Abadi" w:hAnsi="Abadi"/>
+          <w:rFonts w:ascii="Segoe UI" w:hAnsi="Segoe UI" w:cs="Segoe UI"/>
           <w:i/>
           <w:iCs/>
           <w:color w:val="156082" w:themeColor="accent1"/>

</xml_diff>